<commit_message>
fix(em): EM-P1R-HOTFIX-001 ADDRESS parity in 4 measurement templates (v2.59.44)
Replace hardcoded Sępa SSOT with Miejsce pomiaru {{ADDRESS}} via split-run aware templatization.

Co-authored-by: Cursor <cursoragent@cursor.com>
</commit_message>
<xml_diff>
--- a/public/em-measurements/badanie-adsc.template.docx
+++ b/public/em-measurements/badanie-adsc.template.docx
@@ -133,10 +133,10 @@
               <w:jc w:val="center"/>
             </w:pPr>
             <w:r>
-              <w:t xml:space="preserve">Miejsce pomiaru: Wrocław, ul. </w:t>
-            </w:r>
-            <w:r>
-              <w:t>Sępa Sarzyńskiego 83/7</w:t>
+              <w:t xml:space="preserve">Miejsce pomiaru: {{ADDRESS}}</w:t>
+            </w:r>
+            <w:r>
+              <w:t/>
             </w:r>
           </w:p>
         </w:tc>

</xml_diff>